<commit_message>
Added layers.Droput(0.3), to line 47
</commit_message>
<xml_diff>
--- a/IN501_Ridenour_Kresser_Meadows_Mpianin_Galarza_Unit9_Screenshots.docx
+++ b/IN501_Ridenour_Kresser_Meadows_Mpianin_Galarza_Unit9_Screenshots.docx
@@ -111,6 +111,82 @@
     </w:p>
     <w:p>
       <w:r>
+        <w:drawing>
+          <wp:inline distT="0" distB="0" distL="0" distR="0" wp14:anchorId="5AD362FB" wp14:editId="4E97A08E">
+            <wp:extent cx="5943600" cy="2767330"/>
+            <wp:effectExtent l="0" t="0" r="0" b="0"/>
+            <wp:docPr id="387367798" name="Picture 1"/>
+            <wp:cNvGraphicFramePr>
+              <a:graphicFrameLocks xmlns:a="http://schemas.openxmlformats.org/drawingml/2006/main" noChangeAspect="1"/>
+            </wp:cNvGraphicFramePr>
+            <a:graphic xmlns:a="http://schemas.openxmlformats.org/drawingml/2006/main">
+              <a:graphicData uri="http://schemas.openxmlformats.org/drawingml/2006/picture">
+                <pic:pic xmlns:pic="http://schemas.openxmlformats.org/drawingml/2006/picture">
+                  <pic:nvPicPr>
+                    <pic:cNvPr id="387367798" name=""/>
+                    <pic:cNvPicPr/>
+                  </pic:nvPicPr>
+                  <pic:blipFill>
+                    <a:blip r:embed="rId6"/>
+                    <a:stretch>
+                      <a:fillRect/>
+                    </a:stretch>
+                  </pic:blipFill>
+                  <pic:spPr>
+                    <a:xfrm>
+                      <a:off x="0" y="0"/>
+                      <a:ext cx="5943600" cy="2767330"/>
+                    </a:xfrm>
+                    <a:prstGeom prst="rect">
+                      <a:avLst/>
+                    </a:prstGeom>
+                  </pic:spPr>
+                </pic:pic>
+              </a:graphicData>
+            </a:graphic>
+          </wp:inline>
+        </w:drawing>
+      </w:r>
+    </w:p>
+    <w:p>
+      <w:r>
+        <w:drawing>
+          <wp:inline distT="0" distB="0" distL="0" distR="0" wp14:anchorId="0BD3BA68" wp14:editId="4284F9BF">
+            <wp:extent cx="5943600" cy="3911600"/>
+            <wp:effectExtent l="0" t="0" r="0" b="0"/>
+            <wp:docPr id="1910842301" name="Picture 1"/>
+            <wp:cNvGraphicFramePr>
+              <a:graphicFrameLocks xmlns:a="http://schemas.openxmlformats.org/drawingml/2006/main" noChangeAspect="1"/>
+            </wp:cNvGraphicFramePr>
+            <a:graphic xmlns:a="http://schemas.openxmlformats.org/drawingml/2006/main">
+              <a:graphicData uri="http://schemas.openxmlformats.org/drawingml/2006/picture">
+                <pic:pic xmlns:pic="http://schemas.openxmlformats.org/drawingml/2006/picture">
+                  <pic:nvPicPr>
+                    <pic:cNvPr id="1910842301" name=""/>
+                    <pic:cNvPicPr/>
+                  </pic:nvPicPr>
+                  <pic:blipFill>
+                    <a:blip r:embed="rId7"/>
+                    <a:stretch>
+                      <a:fillRect/>
+                    </a:stretch>
+                  </pic:blipFill>
+                  <pic:spPr>
+                    <a:xfrm>
+                      <a:off x="0" y="0"/>
+                      <a:ext cx="5943600" cy="3911600"/>
+                    </a:xfrm>
+                    <a:prstGeom prst="rect">
+                      <a:avLst/>
+                    </a:prstGeom>
+                  </pic:spPr>
+                </pic:pic>
+              </a:graphicData>
+            </a:graphic>
+          </wp:inline>
+        </w:drawing>
+      </w:r>
+      <w:r>
         <w:br w:type="page"/>
       </w:r>
     </w:p>
@@ -144,6 +220,9 @@
     </w:p>
     <w:p>
       <w:r>
+        <w:rPr>
+          <w:noProof/>
+        </w:rPr>
         <w:drawing>
           <wp:inline distT="0" distB="0" distL="0" distR="0" wp14:anchorId="7EE12252" wp14:editId="7CA91EC1">
             <wp:extent cx="5943600" cy="7879080"/>
@@ -160,7 +239,7 @@
                     <pic:cNvPicPr/>
                   </pic:nvPicPr>
                   <pic:blipFill>
-                    <a:blip r:embed="rId6"/>
+                    <a:blip r:embed="rId8"/>
                     <a:stretch>
                       <a:fillRect/>
                     </a:stretch>

</xml_diff>

<commit_message>
Made my changes to the powerpoint, adding screenshots to the word doc. and chnaged line 42: Conv2D filters increased from 32 to 64
</commit_message>
<xml_diff>
--- a/IN501_Ridenour_Kresser_Meadows_Mpianin_Galarza_Unit9_Screenshots.docx
+++ b/IN501_Ridenour_Kresser_Meadows_Mpianin_Galarza_Unit9_Screenshots.docx
@@ -98,14 +98,51 @@
         <w:t>Variation #1 Screenshots</w:t>
       </w:r>
     </w:p>
+    <w:p/>
     <w:p>
       <w:r>
-        <w:br w:type="page"/>
+        <w:drawing>
+          <wp:inline distT="0" distB="0" distL="0" distR="0" wp14:anchorId="32708FF9" wp14:editId="5D996F09">
+            <wp:extent cx="5943600" cy="5001895"/>
+            <wp:effectExtent l="0" t="0" r="0" b="8255"/>
+            <wp:docPr id="1889017253" name="Picture 1"/>
+            <wp:cNvGraphicFramePr>
+              <a:graphicFrameLocks xmlns:a="http://schemas.openxmlformats.org/drawingml/2006/main" noChangeAspect="1"/>
+            </wp:cNvGraphicFramePr>
+            <a:graphic xmlns:a="http://schemas.openxmlformats.org/drawingml/2006/main">
+              <a:graphicData uri="http://schemas.openxmlformats.org/drawingml/2006/picture">
+                <pic:pic xmlns:pic="http://schemas.openxmlformats.org/drawingml/2006/picture">
+                  <pic:nvPicPr>
+                    <pic:cNvPr id="1889017253" name=""/>
+                    <pic:cNvPicPr/>
+                  </pic:nvPicPr>
+                  <pic:blipFill>
+                    <a:blip r:embed="rId6"/>
+                    <a:stretch>
+                      <a:fillRect/>
+                    </a:stretch>
+                  </pic:blipFill>
+                  <pic:spPr>
+                    <a:xfrm>
+                      <a:off x="0" y="0"/>
+                      <a:ext cx="5943600" cy="5001895"/>
+                    </a:xfrm>
+                    <a:prstGeom prst="rect">
+                      <a:avLst/>
+                    </a:prstGeom>
+                  </pic:spPr>
+                </pic:pic>
+              </a:graphicData>
+            </a:graphic>
+          </wp:inline>
+        </w:drawing>
       </w:r>
     </w:p>
+    <w:p/>
+    <w:p/>
+    <w:p/>
     <w:p>
       <w:r>
-        <w:lastRenderedPageBreak/>
         <w:t>Variation #2 Screenshots</w:t>
       </w:r>
     </w:p>
@@ -115,6 +152,7 @@
         <w:rPr>
           <w:noProof/>
         </w:rPr>
+        <w:lastRenderedPageBreak/>
         <w:drawing>
           <wp:inline distT="0" distB="0" distL="0" distR="0" wp14:anchorId="0BD3BA68" wp14:editId="72EB5B56">
             <wp:extent cx="6425565" cy="6156960"/>
@@ -131,7 +169,7 @@
                     <pic:cNvPicPr/>
                   </pic:nvPicPr>
                   <pic:blipFill>
-                    <a:blip r:embed="rId6"/>
+                    <a:blip r:embed="rId7"/>
                     <a:stretch>
                       <a:fillRect/>
                     </a:stretch>
@@ -204,7 +242,7 @@
                     <pic:cNvPicPr/>
                   </pic:nvPicPr>
                   <pic:blipFill>
-                    <a:blip r:embed="rId7"/>
+                    <a:blip r:embed="rId8"/>
                     <a:stretch>
                       <a:fillRect/>
                     </a:stretch>

</xml_diff>

<commit_message>
Changes for final push.
</commit_message>
<xml_diff>
--- a/IN501_Ridenour_Kresser_Meadows_Mpianin_Galarza_Unit9_Screenshots.docx
+++ b/IN501_Ridenour_Kresser_Meadows_Mpianin_Galarza_Unit9_Screenshots.docx
@@ -102,10 +102,10 @@
     <w:p>
       <w:r>
         <w:drawing>
-          <wp:inline distT="0" distB="0" distL="0" distR="0" wp14:anchorId="32708FF9" wp14:editId="5D996F09">
-            <wp:extent cx="5943600" cy="5001895"/>
-            <wp:effectExtent l="0" t="0" r="0" b="8255"/>
-            <wp:docPr id="1889017253" name="Picture 1"/>
+          <wp:inline distT="0" distB="0" distL="0" distR="0" wp14:anchorId="08649730" wp14:editId="1EBB9E2C">
+            <wp:extent cx="5943600" cy="4608195"/>
+            <wp:effectExtent l="0" t="0" r="0" b="1905"/>
+            <wp:docPr id="133960704" name="Picture 1"/>
             <wp:cNvGraphicFramePr>
               <a:graphicFrameLocks xmlns:a="http://schemas.openxmlformats.org/drawingml/2006/main" noChangeAspect="1"/>
             </wp:cNvGraphicFramePr>
@@ -113,7 +113,7 @@
               <a:graphicData uri="http://schemas.openxmlformats.org/drawingml/2006/picture">
                 <pic:pic xmlns:pic="http://schemas.openxmlformats.org/drawingml/2006/picture">
                   <pic:nvPicPr>
-                    <pic:cNvPr id="1889017253" name=""/>
+                    <pic:cNvPr id="133960704" name=""/>
                     <pic:cNvPicPr/>
                   </pic:nvPicPr>
                   <pic:blipFill>
@@ -125,7 +125,7 @@
                   <pic:spPr>
                     <a:xfrm>
                       <a:off x="0" y="0"/>
-                      <a:ext cx="5943600" cy="5001895"/>
+                      <a:ext cx="5943600" cy="4608195"/>
                     </a:xfrm>
                     <a:prstGeom prst="rect">
                       <a:avLst/>
@@ -143,21 +143,23 @@
     <w:p/>
     <w:p>
       <w:r>
+        <w:br w:type="page"/>
+      </w:r>
+    </w:p>
+    <w:p>
+      <w:r>
+        <w:lastRenderedPageBreak/>
         <w:t>Variation #2 Screenshots</w:t>
       </w:r>
     </w:p>
     <w:p/>
     <w:p>
       <w:r>
-        <w:rPr>
-          <w:noProof/>
-        </w:rPr>
-        <w:lastRenderedPageBreak/>
         <w:drawing>
-          <wp:inline distT="0" distB="0" distL="0" distR="0" wp14:anchorId="0BD3BA68" wp14:editId="72EB5B56">
-            <wp:extent cx="6425565" cy="6156960"/>
-            <wp:effectExtent l="0" t="0" r="0" b="0"/>
-            <wp:docPr id="1910842301" name="Picture 1"/>
+          <wp:inline distT="0" distB="0" distL="0" distR="0" wp14:anchorId="5FDA3EFA" wp14:editId="188485F1">
+            <wp:extent cx="5943600" cy="4602480"/>
+            <wp:effectExtent l="0" t="0" r="0" b="7620"/>
+            <wp:docPr id="119145385" name="Picture 1"/>
             <wp:cNvGraphicFramePr>
               <a:graphicFrameLocks xmlns:a="http://schemas.openxmlformats.org/drawingml/2006/main" noChangeAspect="1"/>
             </wp:cNvGraphicFramePr>
@@ -165,7 +167,7 @@
               <a:graphicData uri="http://schemas.openxmlformats.org/drawingml/2006/picture">
                 <pic:pic xmlns:pic="http://schemas.openxmlformats.org/drawingml/2006/picture">
                   <pic:nvPicPr>
-                    <pic:cNvPr id="1910842301" name=""/>
+                    <pic:cNvPr id="119145385" name=""/>
                     <pic:cNvPicPr/>
                   </pic:nvPicPr>
                   <pic:blipFill>
@@ -177,7 +179,7 @@
                   <pic:spPr>
                     <a:xfrm>
                       <a:off x="0" y="0"/>
-                      <a:ext cx="6441366" cy="6172100"/>
+                      <a:ext cx="5943600" cy="4602480"/>
                     </a:xfrm>
                     <a:prstGeom prst="rect">
                       <a:avLst/>
@@ -201,36 +203,11 @@
     </w:p>
     <w:p>
       <w:r>
-        <w:br w:type="page"/>
-      </w:r>
-    </w:p>
-    <w:p>
-      <w:r>
-        <w:lastRenderedPageBreak/>
-        <w:t>Variation #4 Screenshots</w:t>
-      </w:r>
-    </w:p>
-    <w:p>
-      <w:r>
-        <w:br w:type="page"/>
-      </w:r>
-    </w:p>
-    <w:p>
-      <w:r>
-        <w:lastRenderedPageBreak/>
-        <w:t>Variation #5 Screenshots</w:t>
-      </w:r>
-    </w:p>
-    <w:p>
-      <w:r>
-        <w:rPr>
-          <w:noProof/>
-        </w:rPr>
         <w:drawing>
-          <wp:inline distT="0" distB="0" distL="0" distR="0" wp14:anchorId="7EE12252" wp14:editId="7CA91EC1">
-            <wp:extent cx="5943600" cy="7879080"/>
-            <wp:effectExtent l="0" t="0" r="0" b="7620"/>
-            <wp:docPr id="1159876576" name="Picture 1"/>
+          <wp:inline distT="0" distB="0" distL="0" distR="0" wp14:anchorId="0B83FADF" wp14:editId="39BB9F79">
+            <wp:extent cx="5943600" cy="5561965"/>
+            <wp:effectExtent l="0" t="0" r="0" b="635"/>
+            <wp:docPr id="1645373592" name="Picture 1"/>
             <wp:cNvGraphicFramePr>
               <a:graphicFrameLocks xmlns:a="http://schemas.openxmlformats.org/drawingml/2006/main" noChangeAspect="1"/>
             </wp:cNvGraphicFramePr>
@@ -238,7 +215,7 @@
               <a:graphicData uri="http://schemas.openxmlformats.org/drawingml/2006/picture">
                 <pic:pic xmlns:pic="http://schemas.openxmlformats.org/drawingml/2006/picture">
                   <pic:nvPicPr>
-                    <pic:cNvPr id="1159876576" name=""/>
+                    <pic:cNvPr id="1645373592" name=""/>
                     <pic:cNvPicPr/>
                   </pic:nvPicPr>
                   <pic:blipFill>
@@ -250,7 +227,107 @@
                   <pic:spPr>
                     <a:xfrm>
                       <a:off x="0" y="0"/>
-                      <a:ext cx="5943600" cy="7879080"/>
+                      <a:ext cx="5943600" cy="5561965"/>
+                    </a:xfrm>
+                    <a:prstGeom prst="rect">
+                      <a:avLst/>
+                    </a:prstGeom>
+                  </pic:spPr>
+                </pic:pic>
+              </a:graphicData>
+            </a:graphic>
+          </wp:inline>
+        </w:drawing>
+      </w:r>
+    </w:p>
+    <w:p>
+      <w:r>
+        <w:br w:type="page"/>
+      </w:r>
+    </w:p>
+    <w:p>
+      <w:r>
+        <w:lastRenderedPageBreak/>
+        <w:t>Variation #4 Screenshots</w:t>
+      </w:r>
+    </w:p>
+    <w:p>
+      <w:r>
+        <w:drawing>
+          <wp:inline distT="0" distB="0" distL="0" distR="0" wp14:anchorId="59152513" wp14:editId="146AB9F9">
+            <wp:extent cx="5943600" cy="5407025"/>
+            <wp:effectExtent l="0" t="0" r="0" b="3175"/>
+            <wp:docPr id="2086023399" name="Picture 1"/>
+            <wp:cNvGraphicFramePr>
+              <a:graphicFrameLocks xmlns:a="http://schemas.openxmlformats.org/drawingml/2006/main" noChangeAspect="1"/>
+            </wp:cNvGraphicFramePr>
+            <a:graphic xmlns:a="http://schemas.openxmlformats.org/drawingml/2006/main">
+              <a:graphicData uri="http://schemas.openxmlformats.org/drawingml/2006/picture">
+                <pic:pic xmlns:pic="http://schemas.openxmlformats.org/drawingml/2006/picture">
+                  <pic:nvPicPr>
+                    <pic:cNvPr id="2086023399" name=""/>
+                    <pic:cNvPicPr/>
+                  </pic:nvPicPr>
+                  <pic:blipFill>
+                    <a:blip r:embed="rId9"/>
+                    <a:stretch>
+                      <a:fillRect/>
+                    </a:stretch>
+                  </pic:blipFill>
+                  <pic:spPr>
+                    <a:xfrm>
+                      <a:off x="0" y="0"/>
+                      <a:ext cx="5943600" cy="5407025"/>
+                    </a:xfrm>
+                    <a:prstGeom prst="rect">
+                      <a:avLst/>
+                    </a:prstGeom>
+                  </pic:spPr>
+                </pic:pic>
+              </a:graphicData>
+            </a:graphic>
+          </wp:inline>
+        </w:drawing>
+      </w:r>
+    </w:p>
+    <w:p>
+      <w:r>
+        <w:br w:type="page"/>
+      </w:r>
+    </w:p>
+    <w:p>
+      <w:r>
+        <w:lastRenderedPageBreak/>
+        <w:t>Variation #5 Screenshots</w:t>
+      </w:r>
+    </w:p>
+    <w:p>
+      <w:r>
+        <w:drawing>
+          <wp:inline distT="0" distB="0" distL="0" distR="0" wp14:anchorId="1DF44E69" wp14:editId="788BAC33">
+            <wp:extent cx="5943600" cy="5452745"/>
+            <wp:effectExtent l="0" t="0" r="0" b="0"/>
+            <wp:docPr id="1284347077" name="Picture 1"/>
+            <wp:cNvGraphicFramePr>
+              <a:graphicFrameLocks xmlns:a="http://schemas.openxmlformats.org/drawingml/2006/main" noChangeAspect="1"/>
+            </wp:cNvGraphicFramePr>
+            <a:graphic xmlns:a="http://schemas.openxmlformats.org/drawingml/2006/main">
+              <a:graphicData uri="http://schemas.openxmlformats.org/drawingml/2006/picture">
+                <pic:pic xmlns:pic="http://schemas.openxmlformats.org/drawingml/2006/picture">
+                  <pic:nvPicPr>
+                    <pic:cNvPr id="1284347077" name=""/>
+                    <pic:cNvPicPr/>
+                  </pic:nvPicPr>
+                  <pic:blipFill>
+                    <a:blip r:embed="rId10"/>
+                    <a:stretch>
+                      <a:fillRect/>
+                    </a:stretch>
+                  </pic:blipFill>
+                  <pic:spPr>
+                    <a:xfrm>
+                      <a:off x="0" y="0"/>
+                      <a:ext cx="5943600" cy="5452745"/>
                     </a:xfrm>
                     <a:prstGeom prst="rect">
                       <a:avLst/>

</xml_diff>